<commit_message>
Added AI comparison assignment
</commit_message>
<xml_diff>
--- a/03- Lecture 03- 14-09-2026.docx
+++ b/03- Lecture 03- 14-09-2026.docx
@@ -41,6 +41,14 @@
     </w:p>
     <w:sdt>
       <w:sdtPr>
+        <w:rPr>
+          <w:rFonts w:asciiTheme="minorHAnsi" w:eastAsiaTheme="minorHAnsi" w:hAnsiTheme="minorHAnsi" w:cstheme="minorBidi"/>
+          <w:color w:val="auto"/>
+          <w:kern w:val="2"/>
+          <w:sz w:val="24"/>
+          <w:szCs w:val="24"/>
+          <w14:ligatures w14:val="standardContextual"/>
+        </w:rPr>
         <w:id w:val="-1767831222"/>
         <w:docPartObj>
           <w:docPartGallery w:val="Table of Contents"/>
@@ -49,15 +57,9 @@
       </w:sdtPr>
       <w:sdtEndPr>
         <w:rPr>
-          <w:rFonts w:asciiTheme="minorHAnsi" w:eastAsiaTheme="minorHAnsi" w:hAnsiTheme="minorHAnsi" w:cstheme="minorBidi"/>
           <w:b/>
           <w:bCs/>
           <w:noProof/>
-          <w:color w:val="auto"/>
-          <w:kern w:val="2"/>
-          <w:sz w:val="24"/>
-          <w:szCs w:val="24"/>
-          <w14:ligatures w14:val="standardContextual"/>
         </w:rPr>
       </w:sdtEndPr>
       <w:sdtContent>
@@ -3551,15 +3553,7 @@
       </w:r>
       <w:proofErr w:type="spellEnd"/>
       <w:r>
-        <w:t xml:space="preserve">. Sad </w:t>
-      </w:r>
-      <w:proofErr w:type="gramStart"/>
-      <w:r>
-        <w:t>→ ?</w:t>
-      </w:r>
-      <w:proofErr w:type="gramEnd"/>
-      <w:r>
-        <w:t xml:space="preserve">” </w:t>
+        <w:t xml:space="preserve">. Sad → ?” </w:t>
       </w:r>
     </w:p>
     <w:p>
@@ -3601,15 +3595,7 @@
         <w:t>Example:</w:t>
       </w:r>
       <w:r>
-        <w:t xml:space="preserve"> “Cat → Animal, Rose → Plant, Eagle </w:t>
-      </w:r>
-      <w:proofErr w:type="gramStart"/>
-      <w:r>
-        <w:t>→ ?</w:t>
-      </w:r>
-      <w:proofErr w:type="gramEnd"/>
-      <w:r>
-        <w:t xml:space="preserve">” </w:t>
+        <w:t xml:space="preserve"> “Cat → Animal, Rose → Plant, Eagle → ?” </w:t>
       </w:r>
     </w:p>
     <w:p>
@@ -4483,21 +4469,12 @@
       <w:r>
         <w:t xml:space="preserve">Every formula normally begins with an </w:t>
       </w:r>
-      <w:proofErr w:type="gramStart"/>
-      <w:r>
-        <w:rPr>
-          <w:b/>
-          <w:bCs/>
-        </w:rPr>
-        <w:t>equals</w:t>
-      </w:r>
-      <w:proofErr w:type="gramEnd"/>
-      <w:r>
-        <w:rPr>
-          <w:b/>
-          <w:bCs/>
-        </w:rPr>
-        <w:t xml:space="preserve"> sign (=)</w:t>
+      <w:r>
+        <w:rPr>
+          <w:b/>
+          <w:bCs/>
+        </w:rPr>
+        <w:t>equals sign (=)</w:t>
       </w:r>
       <w:r>
         <w:t>.</w:t>
@@ -4814,13 +4791,8 @@
             <w:hideMark/>
           </w:tcPr>
           <w:p>
-            <w:proofErr w:type="gramStart"/>
-            <w:r>
-              <w:t>SUM(</w:t>
-            </w:r>
-            <w:proofErr w:type="gramEnd"/>
-            <w:r>
-              <w:t>)</w:t>
+            <w:r>
+              <w:t>SUM()</w:t>
             </w:r>
           </w:p>
         </w:tc>
@@ -5302,15 +5274,7 @@
     </w:p>
     <w:p>
       <w:r>
-        <w:t>=(A1+B</w:t>
-      </w:r>
-      <w:proofErr w:type="gramStart"/>
-      <w:r>
-        <w:t>1)*</w:t>
-      </w:r>
-      <w:proofErr w:type="gramEnd"/>
-      <w:r>
-        <w:t>2</w:t>
+        <w:t>=(A1+B1)*2</w:t>
       </w:r>
     </w:p>
     <w:p>
@@ -5521,15 +5485,7 @@
     </w:p>
     <w:p>
       <w:r>
-        <w:t>=</w:t>
-      </w:r>
-      <w:proofErr w:type="gramStart"/>
-      <w:r>
-        <w:t>FUNCTION(</w:t>
-      </w:r>
-      <w:proofErr w:type="gramEnd"/>
-      <w:r>
-        <w:t>arguments)</w:t>
+        <w:t>=FUNCTION(arguments)</w:t>
       </w:r>
     </w:p>
     <w:p>
@@ -5539,15 +5495,7 @@
     </w:p>
     <w:p>
       <w:r>
-        <w:t>=</w:t>
-      </w:r>
-      <w:proofErr w:type="gramStart"/>
-      <w:r>
-        <w:t>SUM(</w:t>
-      </w:r>
-      <w:proofErr w:type="gramEnd"/>
-      <w:r>
-        <w:t>A1:A10)</w:t>
+        <w:t>=SUM(A1:A10)</w:t>
       </w:r>
     </w:p>
     <w:p>
@@ -5568,21 +5516,12 @@
           <w:bCs/>
         </w:rPr>
       </w:pPr>
-      <w:proofErr w:type="gramStart"/>
-      <w:r>
-        <w:rPr>
-          <w:b/>
-          <w:bCs/>
-        </w:rPr>
-        <w:t>SUM(</w:t>
-      </w:r>
-      <w:proofErr w:type="gramEnd"/>
-      <w:r>
-        <w:rPr>
-          <w:b/>
-          <w:bCs/>
-        </w:rPr>
-        <w:t>)</w:t>
+      <w:r>
+        <w:rPr>
+          <w:b/>
+          <w:bCs/>
+        </w:rPr>
+        <w:t>SUM()</w:t>
       </w:r>
     </w:p>
     <w:p>
@@ -5592,39 +5531,22 @@
     </w:p>
     <w:p>
       <w:r>
-        <w:t>=</w:t>
-      </w:r>
-      <w:proofErr w:type="gramStart"/>
-      <w:r>
-        <w:t>SUM(</w:t>
-      </w:r>
-      <w:proofErr w:type="gramEnd"/>
-      <w:r>
-        <w:t>A1:A10)</w:t>
-      </w:r>
-    </w:p>
-    <w:p>
-      <w:pPr>
-        <w:rPr>
-          <w:b/>
-          <w:bCs/>
-        </w:rPr>
-      </w:pPr>
-      <w:proofErr w:type="gramStart"/>
-      <w:r>
-        <w:rPr>
-          <w:b/>
-          <w:bCs/>
-        </w:rPr>
-        <w:t>AVERAGE(</w:t>
-      </w:r>
-      <w:proofErr w:type="gramEnd"/>
-      <w:r>
-        <w:rPr>
-          <w:b/>
-          <w:bCs/>
-        </w:rPr>
-        <w:t>)</w:t>
+        <w:t>=SUM(A1:A10)</w:t>
+      </w:r>
+    </w:p>
+    <w:p>
+      <w:pPr>
+        <w:rPr>
+          <w:b/>
+          <w:bCs/>
+        </w:rPr>
+      </w:pPr>
+      <w:r>
+        <w:rPr>
+          <w:b/>
+          <w:bCs/>
+        </w:rPr>
+        <w:t>AVERAGE()</w:t>
       </w:r>
     </w:p>
     <w:p>
@@ -5634,39 +5556,22 @@
     </w:p>
     <w:p>
       <w:r>
-        <w:t>=</w:t>
-      </w:r>
-      <w:proofErr w:type="gramStart"/>
-      <w:r>
-        <w:t>AVERAGE(</w:t>
-      </w:r>
-      <w:proofErr w:type="gramEnd"/>
-      <w:r>
-        <w:t>A1:A10)</w:t>
-      </w:r>
-    </w:p>
-    <w:p>
-      <w:pPr>
-        <w:rPr>
-          <w:b/>
-          <w:bCs/>
-        </w:rPr>
-      </w:pPr>
-      <w:proofErr w:type="gramStart"/>
-      <w:r>
-        <w:rPr>
-          <w:b/>
-          <w:bCs/>
-        </w:rPr>
-        <w:t>MIN(</w:t>
-      </w:r>
-      <w:proofErr w:type="gramEnd"/>
-      <w:r>
-        <w:rPr>
-          <w:b/>
-          <w:bCs/>
-        </w:rPr>
-        <w:t>)</w:t>
+        <w:t>=AVERAGE(A1:A10)</w:t>
+      </w:r>
+    </w:p>
+    <w:p>
+      <w:pPr>
+        <w:rPr>
+          <w:b/>
+          <w:bCs/>
+        </w:rPr>
+      </w:pPr>
+      <w:r>
+        <w:rPr>
+          <w:b/>
+          <w:bCs/>
+        </w:rPr>
+        <w:t>MIN()</w:t>
       </w:r>
     </w:p>
     <w:p>
@@ -5676,39 +5581,22 @@
     </w:p>
     <w:p>
       <w:r>
-        <w:t>=</w:t>
-      </w:r>
-      <w:proofErr w:type="gramStart"/>
-      <w:r>
-        <w:t>MIN(</w:t>
-      </w:r>
-      <w:proofErr w:type="gramEnd"/>
-      <w:r>
-        <w:t>A1:A10)</w:t>
-      </w:r>
-    </w:p>
-    <w:p>
-      <w:pPr>
-        <w:rPr>
-          <w:b/>
-          <w:bCs/>
-        </w:rPr>
-      </w:pPr>
-      <w:proofErr w:type="gramStart"/>
-      <w:r>
-        <w:rPr>
-          <w:b/>
-          <w:bCs/>
-        </w:rPr>
-        <w:t>MAX(</w:t>
-      </w:r>
-      <w:proofErr w:type="gramEnd"/>
-      <w:r>
-        <w:rPr>
-          <w:b/>
-          <w:bCs/>
-        </w:rPr>
-        <w:t>)</w:t>
+        <w:t>=MIN(A1:A10)</w:t>
+      </w:r>
+    </w:p>
+    <w:p>
+      <w:pPr>
+        <w:rPr>
+          <w:b/>
+          <w:bCs/>
+        </w:rPr>
+      </w:pPr>
+      <w:r>
+        <w:rPr>
+          <w:b/>
+          <w:bCs/>
+        </w:rPr>
+        <w:t>MAX()</w:t>
       </w:r>
     </w:p>
     <w:p>
@@ -5718,39 +5606,22 @@
     </w:p>
     <w:p>
       <w:r>
-        <w:t>=</w:t>
-      </w:r>
-      <w:proofErr w:type="gramStart"/>
-      <w:r>
-        <w:t>MAX(</w:t>
-      </w:r>
-      <w:proofErr w:type="gramEnd"/>
-      <w:r>
-        <w:t>A1:A10)</w:t>
-      </w:r>
-    </w:p>
-    <w:p>
-      <w:pPr>
-        <w:rPr>
-          <w:b/>
-          <w:bCs/>
-        </w:rPr>
-      </w:pPr>
-      <w:proofErr w:type="gramStart"/>
-      <w:r>
-        <w:rPr>
-          <w:b/>
-          <w:bCs/>
-        </w:rPr>
-        <w:t>COUNT(</w:t>
-      </w:r>
-      <w:proofErr w:type="gramEnd"/>
-      <w:r>
-        <w:rPr>
-          <w:b/>
-          <w:bCs/>
-        </w:rPr>
-        <w:t>)</w:t>
+        <w:t>=MAX(A1:A10)</w:t>
+      </w:r>
+    </w:p>
+    <w:p>
+      <w:pPr>
+        <w:rPr>
+          <w:b/>
+          <w:bCs/>
+        </w:rPr>
+      </w:pPr>
+      <w:r>
+        <w:rPr>
+          <w:b/>
+          <w:bCs/>
+        </w:rPr>
+        <w:t>COUNT()</w:t>
       </w:r>
     </w:p>
     <w:p>
@@ -5760,39 +5631,22 @@
     </w:p>
     <w:p>
       <w:r>
-        <w:t>=</w:t>
-      </w:r>
-      <w:proofErr w:type="gramStart"/>
-      <w:r>
-        <w:t>COUNT(</w:t>
-      </w:r>
-      <w:proofErr w:type="gramEnd"/>
-      <w:r>
-        <w:t>A1:A10)</w:t>
-      </w:r>
-    </w:p>
-    <w:p>
-      <w:pPr>
-        <w:rPr>
-          <w:b/>
-          <w:bCs/>
-        </w:rPr>
-      </w:pPr>
-      <w:proofErr w:type="gramStart"/>
-      <w:r>
-        <w:rPr>
-          <w:b/>
-          <w:bCs/>
-        </w:rPr>
-        <w:t>COUNTA(</w:t>
-      </w:r>
-      <w:proofErr w:type="gramEnd"/>
-      <w:r>
-        <w:rPr>
-          <w:b/>
-          <w:bCs/>
-        </w:rPr>
-        <w:t>)</w:t>
+        <w:t>=COUNT(A1:A10)</w:t>
+      </w:r>
+    </w:p>
+    <w:p>
+      <w:pPr>
+        <w:rPr>
+          <w:b/>
+          <w:bCs/>
+        </w:rPr>
+      </w:pPr>
+      <w:r>
+        <w:rPr>
+          <w:b/>
+          <w:bCs/>
+        </w:rPr>
+        <w:t>COUNTA()</w:t>
       </w:r>
     </w:p>
     <w:p>
@@ -5802,39 +5656,22 @@
     </w:p>
     <w:p>
       <w:r>
-        <w:t>=</w:t>
-      </w:r>
-      <w:proofErr w:type="gramStart"/>
-      <w:r>
-        <w:t>COUNTA(</w:t>
-      </w:r>
-      <w:proofErr w:type="gramEnd"/>
-      <w:r>
-        <w:t>A1:A10)</w:t>
-      </w:r>
-    </w:p>
-    <w:p>
-      <w:pPr>
-        <w:rPr>
-          <w:b/>
-          <w:bCs/>
-        </w:rPr>
-      </w:pPr>
-      <w:proofErr w:type="gramStart"/>
-      <w:r>
-        <w:rPr>
-          <w:b/>
-          <w:bCs/>
-        </w:rPr>
-        <w:t>COUNTIF(</w:t>
-      </w:r>
-      <w:proofErr w:type="gramEnd"/>
-      <w:r>
-        <w:rPr>
-          <w:b/>
-          <w:bCs/>
-        </w:rPr>
-        <w:t>)</w:t>
+        <w:t>=COUNTA(A1:A10)</w:t>
+      </w:r>
+    </w:p>
+    <w:p>
+      <w:pPr>
+        <w:rPr>
+          <w:b/>
+          <w:bCs/>
+        </w:rPr>
+      </w:pPr>
+      <w:r>
+        <w:rPr>
+          <w:b/>
+          <w:bCs/>
+        </w:rPr>
+        <w:t>COUNTIF()</w:t>
       </w:r>
     </w:p>
     <w:p>
@@ -5844,39 +5681,22 @@
     </w:p>
     <w:p>
       <w:r>
-        <w:t>=</w:t>
-      </w:r>
-      <w:proofErr w:type="gramStart"/>
-      <w:r>
-        <w:t>COUNTIF(</w:t>
-      </w:r>
-      <w:proofErr w:type="gramEnd"/>
-      <w:r>
-        <w:t>A1:A10,"&gt;50")</w:t>
-      </w:r>
-    </w:p>
-    <w:p>
-      <w:pPr>
-        <w:rPr>
-          <w:b/>
-          <w:bCs/>
-        </w:rPr>
-      </w:pPr>
-      <w:proofErr w:type="gramStart"/>
-      <w:r>
-        <w:rPr>
-          <w:b/>
-          <w:bCs/>
-        </w:rPr>
-        <w:t>SUMIF(</w:t>
-      </w:r>
-      <w:proofErr w:type="gramEnd"/>
-      <w:r>
-        <w:rPr>
-          <w:b/>
-          <w:bCs/>
-        </w:rPr>
-        <w:t>)</w:t>
+        <w:t>=COUNTIF(A1:A10,"&gt;50")</w:t>
+      </w:r>
+    </w:p>
+    <w:p>
+      <w:pPr>
+        <w:rPr>
+          <w:b/>
+          <w:bCs/>
+        </w:rPr>
+      </w:pPr>
+      <w:r>
+        <w:rPr>
+          <w:b/>
+          <w:bCs/>
+        </w:rPr>
+        <w:t>SUMIF()</w:t>
       </w:r>
     </w:p>
     <w:p>
@@ -5886,39 +5706,22 @@
     </w:p>
     <w:p>
       <w:r>
-        <w:t>=</w:t>
-      </w:r>
-      <w:proofErr w:type="gramStart"/>
-      <w:r>
-        <w:t>SUMIF(</w:t>
-      </w:r>
-      <w:proofErr w:type="gramEnd"/>
-      <w:r>
-        <w:t>A1:A10,"&gt;50")</w:t>
-      </w:r>
-    </w:p>
-    <w:p>
-      <w:pPr>
-        <w:rPr>
-          <w:b/>
-          <w:bCs/>
-        </w:rPr>
-      </w:pPr>
-      <w:proofErr w:type="gramStart"/>
-      <w:r>
-        <w:rPr>
-          <w:b/>
-          <w:bCs/>
-        </w:rPr>
-        <w:t>IF(</w:t>
-      </w:r>
-      <w:proofErr w:type="gramEnd"/>
-      <w:r>
-        <w:rPr>
-          <w:b/>
-          <w:bCs/>
-        </w:rPr>
-        <w:t>)</w:t>
+        <w:t>=SUMIF(A1:A10,"&gt;50")</w:t>
+      </w:r>
+    </w:p>
+    <w:p>
+      <w:pPr>
+        <w:rPr>
+          <w:b/>
+          <w:bCs/>
+        </w:rPr>
+      </w:pPr>
+      <w:r>
+        <w:rPr>
+          <w:b/>
+          <w:bCs/>
+        </w:rPr>
+        <w:t>IF()</w:t>
       </w:r>
     </w:p>
     <w:p>
@@ -5980,15 +5783,7 @@
     </w:p>
     <w:p>
       <w:r>
-        <w:t>=</w:t>
-      </w:r>
-      <w:proofErr w:type="gramStart"/>
-      <w:r>
-        <w:t>SUM(</w:t>
-      </w:r>
-      <w:proofErr w:type="gramEnd"/>
-      <w:r>
-        <w:t>A1:B1)</w:t>
+        <w:t>=SUM(A1:B1)</w:t>
       </w:r>
     </w:p>
     <w:p>
@@ -7091,7 +6886,7 @@
     <w:p>
       <w:r>
         <w:pict w14:anchorId="01D0F221">
-          <v:rect id="_x0000_i1087" style="width:0;height:1.5pt" o:hralign="center" o:hrstd="t" o:hr="t" fillcolor="#a0a0a0" stroked="f"/>
+          <v:rect id="_x0000_i1025" style="width:0;height:1.5pt" o:hralign="center" o:hrstd="t" o:hr="t" fillcolor="#a0a0a0" stroked="f"/>
         </w:pict>
       </w:r>
     </w:p>
@@ -7408,7 +7203,7 @@
     <w:p>
       <w:r>
         <w:pict w14:anchorId="47E58785">
-          <v:rect id="_x0000_i1088" style="width:0;height:1.5pt" o:hralign="center" o:hrstd="t" o:hr="t" fillcolor="#a0a0a0" stroked="f"/>
+          <v:rect id="_x0000_i1026" style="width:0;height:1.5pt" o:hralign="center" o:hrstd="t" o:hr="t" fillcolor="#a0a0a0" stroked="f"/>
         </w:pict>
       </w:r>
     </w:p>
@@ -7633,13 +7428,8 @@
             <w:hideMark/>
           </w:tcPr>
           <w:p>
-            <w:proofErr w:type="gramStart"/>
-            <w:r>
-              <w:t>Usually</w:t>
-            </w:r>
-            <w:proofErr w:type="gramEnd"/>
-            <w:r>
-              <w:t xml:space="preserve"> meaningful</w:t>
+            <w:r>
+              <w:t>Usually meaningful</w:t>
             </w:r>
           </w:p>
         </w:tc>
@@ -8211,7 +8001,13 @@
         </w:numPr>
       </w:pPr>
       <w:r>
-        <w:t>Categorical data can also be divided into ordered categorical data (Grades) pr unordered categorical data (gender).</w:t>
+        <w:t xml:space="preserve">Categorical data can also be divided into ordered categorical data (Grades) </w:t>
+      </w:r>
+      <w:r>
+        <w:t xml:space="preserve">and </w:t>
+      </w:r>
+      <w:r>
+        <w:t>unordered categorical data (gender).</w:t>
       </w:r>
     </w:p>
     <w:p>
@@ -8588,7 +8384,7 @@
     <w:p>
       <w:r>
         <w:pict w14:anchorId="579E7DF0">
-          <v:rect id="_x0000_i1089" style="width:0;height:1.5pt" o:hralign="center" o:hrstd="t" o:hr="t" fillcolor="#a0a0a0" stroked="f"/>
+          <v:rect id="_x0000_i1027" style="width:0;height:1.5pt" o:hralign="center" o:hrstd="t" o:hr="t" fillcolor="#a0a0a0" stroked="f"/>
         </w:pict>
       </w:r>
     </w:p>
@@ -9103,7 +8899,7 @@
     <w:p>
       <w:r>
         <w:pict w14:anchorId="7652341B">
-          <v:rect id="_x0000_i1090" style="width:0;height:1.5pt" o:hralign="center" o:hrstd="t" o:hr="t" fillcolor="#a0a0a0" stroked="f"/>
+          <v:rect id="_x0000_i1028" style="width:0;height:1.5pt" o:hralign="center" o:hrstd="t" o:hr="t" fillcolor="#a0a0a0" stroked="f"/>
         </w:pict>
       </w:r>
     </w:p>
@@ -9342,7 +9138,7 @@
     <w:p>
       <w:r>
         <w:pict w14:anchorId="4AA5DA6E">
-          <v:rect id="_x0000_i1091" style="width:0;height:1.5pt" o:hralign="center" o:hrstd="t" o:hr="t" fillcolor="#a0a0a0" stroked="f"/>
+          <v:rect id="_x0000_i1029" style="width:0;height:1.5pt" o:hralign="center" o:hrstd="t" o:hr="t" fillcolor="#a0a0a0" stroked="f"/>
         </w:pict>
       </w:r>
     </w:p>
@@ -9454,7 +9250,6 @@
         <w:t xml:space="preserve"> </w:t>
       </w:r>
       <w:proofErr w:type="spellStart"/>
-      <w:proofErr w:type="gramStart"/>
       <w:r>
         <w:rPr>
           <w:rStyle w:val="m"/>
@@ -9474,7 +9269,6 @@
         <w:t>DataFrame</w:t>
       </w:r>
       <w:proofErr w:type="spellEnd"/>
-      <w:proofErr w:type="gramEnd"/>
       <w:r>
         <w:rPr>
           <w:rStyle w:val="HTMLCode"/>
@@ -9626,23 +9420,15 @@
         <w:rPr>
           <w:rStyle w:val="HTMLCode"/>
         </w:rPr>
-        <w:t>get_</w:t>
-      </w:r>
-      <w:proofErr w:type="gramStart"/>
+        <w:t>get_dummies</w:t>
+      </w:r>
+      <w:proofErr w:type="spellEnd"/>
       <w:r>
         <w:rPr>
           <w:rStyle w:val="HTMLCode"/>
         </w:rPr>
-        <w:t>dummies</w:t>
-      </w:r>
-      <w:proofErr w:type="spellEnd"/>
-      <w:r>
-        <w:rPr>
-          <w:rStyle w:val="HTMLCode"/>
-        </w:rPr>
         <w:t>(</w:t>
       </w:r>
-      <w:proofErr w:type="gramEnd"/>
       <w:r>
         <w:rPr>
           <w:rStyle w:val="m"/>
@@ -12831,6 +12617,7 @@
   <w:style w:type="character" w:default="1" w:styleId="DefaultParagraphFont">
     <w:name w:val="Default Paragraph Font"/>
     <w:uiPriority w:val="1"/>
+    <w:semiHidden/>
     <w:unhideWhenUsed/>
   </w:style>
   <w:style w:type="table" w:default="1" w:styleId="TableNormal">

</xml_diff>